<commit_message>
Actualizar el informe con portada MIMETIC y titulos en color negro
</commit_message>
<xml_diff>
--- a/Informe_Limpieza_Datos_Salud.docx
+++ b/Informe_Limpieza_Datos_Salud.docx
@@ -3,94 +3,244 @@
 <w:document xmlns:wpc="http://schemas.microsoft.com/office/word/2010/wordprocessingCanvas" xmlns:cx="http://schemas.microsoft.com/office/drawing/2014/chartex" xmlns:cx1="http://schemas.microsoft.com/office/drawing/2015/9/8/chartex" xmlns:cx2="http://schemas.microsoft.com/office/drawing/2015/10/21/chartex" xmlns:cx3="http://schemas.microsoft.com/office/drawing/2016/5/9/chartex" xmlns:cx4="http://schemas.microsoft.com/office/drawing/2016/5/10/chartex" xmlns:cx5="http://schemas.microsoft.com/office/drawing/2016/5/11/chartex" xmlns:cx6="http://schemas.microsoft.com/office/drawing/2016/5/12/chartex" xmlns:cx7="http://schemas.microsoft.com/office/drawing/2016/5/13/chartex" xmlns:cx8="http://schemas.microsoft.com/office/drawing/2016/5/14/chartex" xmlns:mc="http://schemas.openxmlformats.org/markup-compatibility/2006" xmlns:aink="http://schemas.microsoft.com/office/drawing/2016/ink" xmlns:am3d="http://schemas.microsoft.com/office/drawing/2017/model3d" xmlns:o="urn:schemas-microsoft-com:office:office" xmlns:oel="http://schemas.microsoft.com/office/2019/extlst" xmlns:r="http://schemas.openxmlformats.org/officeDocument/2006/relationships" xmlns:m="http://schemas.openxmlformats.org/officeDocument/2006/math" xmlns:v="urn:schemas-microsoft-com:vml" xmlns:wp14="http://schemas.microsoft.com/office/word/2010/wordprocessingDrawing" xmlns:wp="http://schemas.openxmlformats.org/drawingml/2006/wordprocessingDrawing" xmlns:w10="urn:schemas-microsoft-com:office:word" xmlns:w="http://schemas.openxmlformats.org/wordprocessingml/2006/main" xmlns:w14="http://schemas.microsoft.com/office/word/2010/wordml" xmlns:w15="http://schemas.microsoft.com/office/word/2012/wordml" xmlns:w16cex="http://schemas.microsoft.com/office/word/2018/wordml/cex" xmlns:w16cid="http://schemas.microsoft.com/office/word/2016/wordml/cid" xmlns:w16="http://schemas.microsoft.com/office/word/2018/wordml" xmlns:w16du="http://schemas.microsoft.com/office/word/2023/wordml/word16du" xmlns:w16sdtdh="http://schemas.microsoft.com/office/word/2020/wordml/sdtdatahash" xmlns:w16sdtfl="http://schemas.microsoft.com/office/word/2024/wordml/sdtformatlock" xmlns:w16se="http://schemas.microsoft.com/office/word/2015/wordml/symex" xmlns:wpg="http://schemas.microsoft.com/office/word/2010/wordprocessingGroup" xmlns:wpi="http://schemas.microsoft.com/office/word/2010/wordprocessingInk" xmlns:wne="http://schemas.microsoft.com/office/word/2006/wordml" xmlns:wps="http://schemas.microsoft.com/office/word/2010/wordprocessingShape" mc:Ignorable="w14 w15 w16se w16cid w16 w16cex w16sdtdh w16sdtfl w16du wp14">
   <w:body>
     <w:p/>
-    <w:p/>
-    <w:p/>
     <w:p>
       <w:pPr>
         <w:jc w:val="center"/>
+        <w:rPr>
+          <w:lang w:val="es-CO"/>
+        </w:rPr>
       </w:pPr>
       <w:r>
         <w:rPr>
           <w:b/>
-        </w:rPr>
-        <w:t>Limpieza de datos del Healthcare Dataset</w:t>
+          <w:color w:val="000000"/>
+          <w:sz w:val="56"/>
+          <w:lang w:val="es-CO"/>
+        </w:rPr>
+        <w:t>MIMETIC</w:t>
       </w:r>
     </w:p>
-    <w:p/>
-    <w:p/>
+    <w:p>
+      <w:pPr>
+        <w:rPr>
+          <w:lang w:val="es-CO"/>
+        </w:rPr>
+      </w:pPr>
+    </w:p>
     <w:p>
       <w:pPr>
         <w:jc w:val="center"/>
+        <w:rPr>
+          <w:lang w:val="es-CO"/>
+        </w:rPr>
       </w:pPr>
       <w:r>
+        <w:rPr>
+          <w:b/>
+          <w:color w:val="000000"/>
+          <w:sz w:val="40"/>
+          <w:lang w:val="es-CO"/>
+        </w:rPr>
+        <w:t xml:space="preserve">Limpieza de datos del </w:t>
+      </w:r>
+      <w:proofErr w:type="spellStart"/>
+      <w:r>
+        <w:rPr>
+          <w:b/>
+          <w:color w:val="000000"/>
+          <w:sz w:val="40"/>
+          <w:lang w:val="es-CO"/>
+        </w:rPr>
+        <w:t>Healthcare</w:t>
+      </w:r>
+      <w:proofErr w:type="spellEnd"/>
+      <w:r>
+        <w:rPr>
+          <w:b/>
+          <w:color w:val="000000"/>
+          <w:sz w:val="40"/>
+          <w:lang w:val="es-CO"/>
+        </w:rPr>
+        <w:t xml:space="preserve"> </w:t>
+      </w:r>
+      <w:proofErr w:type="spellStart"/>
+      <w:r>
+        <w:rPr>
+          <w:b/>
+          <w:color w:val="000000"/>
+          <w:sz w:val="40"/>
+          <w:lang w:val="es-CO"/>
+        </w:rPr>
+        <w:t>Dataset</w:t>
+      </w:r>
+      <w:proofErr w:type="spellEnd"/>
+    </w:p>
+    <w:p>
+      <w:pPr>
+        <w:rPr>
+          <w:lang w:val="es-CO"/>
+        </w:rPr>
+      </w:pPr>
+    </w:p>
+    <w:p>
+      <w:pPr>
+        <w:rPr>
+          <w:lang w:val="es-CO"/>
+        </w:rPr>
+      </w:pPr>
+    </w:p>
+    <w:p>
+      <w:pPr>
+        <w:jc w:val="center"/>
+        <w:rPr>
+          <w:lang w:val="es-CO"/>
+        </w:rPr>
+      </w:pPr>
+      <w:r>
+        <w:rPr>
+          <w:b/>
+          <w:color w:val="000000"/>
+          <w:sz w:val="28"/>
+          <w:lang w:val="es-CO"/>
+        </w:rPr>
         <w:t>Manuel José Rivera Guzmán</w:t>
+      </w:r>
+    </w:p>
+    <w:p>
+      <w:pPr>
+        <w:jc w:val="center"/>
+        <w:rPr>
+          <w:lang w:val="es-CO"/>
+        </w:rPr>
+      </w:pPr>
+      <w:r>
+        <w:rPr>
+          <w:b/>
+          <w:color w:val="000000"/>
+          <w:sz w:val="28"/>
+          <w:lang w:val="es-CO"/>
+        </w:rPr>
+        <w:t>Julián Andrés Correa Cuevas</w:t>
+      </w:r>
+    </w:p>
+    <w:p>
+      <w:pPr>
+        <w:rPr>
+          <w:lang w:val="es-CO"/>
+        </w:rPr>
+      </w:pPr>
+    </w:p>
+    <w:p>
+      <w:pPr>
+        <w:jc w:val="center"/>
+        <w:rPr>
+          <w:lang w:val="es-CO"/>
+        </w:rPr>
+      </w:pPr>
+      <w:r>
+        <w:rPr>
+          <w:color w:val="000000"/>
+          <w:lang w:val="es-CO"/>
+        </w:rPr>
+        <w:t>Corporación Universitaria Minuto de Dios</w:t>
+      </w:r>
+    </w:p>
+    <w:p>
+      <w:pPr>
+        <w:jc w:val="center"/>
+        <w:rPr>
+          <w:lang w:val="es-CO"/>
+        </w:rPr>
+      </w:pPr>
+      <w:r>
+        <w:rPr>
+          <w:color w:val="000000"/>
+          <w:lang w:val="es-CO"/>
+        </w:rPr>
+        <w:t>Programa de Ingeniería de Sistemas</w:t>
+      </w:r>
+    </w:p>
+    <w:p>
+      <w:pPr>
+        <w:jc w:val="center"/>
+        <w:rPr>
+          <w:lang w:val="es-CO"/>
+        </w:rPr>
+      </w:pPr>
+      <w:r>
+        <w:rPr>
+          <w:color w:val="000000"/>
+          <w:lang w:val="es-CO"/>
+        </w:rPr>
+        <w:t>Materia: Minería de Datos</w:t>
+      </w:r>
+    </w:p>
+    <w:p>
+      <w:pPr>
+        <w:jc w:val="center"/>
+        <w:rPr>
+          <w:lang w:val="es-CO"/>
+        </w:rPr>
+      </w:pPr>
+      <w:r>
+        <w:rPr>
+          <w:color w:val="000000"/>
+          <w:lang w:val="es-CO"/>
+        </w:rPr>
+        <w:t>Docente: Esteban Ernesto Morales Castro</w:t>
       </w:r>
     </w:p>
     <w:p>
       <w:pPr>
         <w:jc w:val="center"/>
       </w:pPr>
-      <w:r>
-        <w:t>Julián Andrés Correa Cuevas</w:t>
+      <w:proofErr w:type="spellStart"/>
+      <w:r>
+        <w:rPr>
+          <w:color w:val="000000"/>
+        </w:rPr>
+        <w:t>Ibagué</w:t>
+      </w:r>
+      <w:proofErr w:type="spellEnd"/>
+      <w:r>
+        <w:rPr>
+          <w:color w:val="000000"/>
+        </w:rPr>
+        <w:t>, 2026</w:t>
       </w:r>
     </w:p>
-    <w:p/>
     <w:p>
-      <w:pPr>
-        <w:jc w:val="center"/>
-      </w:pPr>
-      <w:r>
-        <w:t>Corporación Universitaria Minuto de Dios</w:t>
+      <w:r>
+        <w:br w:type="page"/>
       </w:r>
     </w:p>
     <w:p>
       <w:pPr>
         <w:jc w:val="center"/>
       </w:pPr>
-      <w:r>
-        <w:t>Programa de Ingeniería de Sistemas</w:t>
-      </w:r>
-    </w:p>
-    <w:p>
-      <w:pPr>
-        <w:jc w:val="center"/>
-      </w:pPr>
-      <w:r>
-        <w:t>Materia: Minería de Datos</w:t>
-      </w:r>
-    </w:p>
-    <w:p>
-      <w:pPr>
-        <w:jc w:val="center"/>
-      </w:pPr>
-      <w:r>
-        <w:t>Docente: Esteban Ernesto Morales Castro</w:t>
-      </w:r>
-    </w:p>
-    <w:p>
-      <w:pPr>
-        <w:jc w:val="center"/>
-      </w:pPr>
-      <w:r>
-        <w:t>Ibagué, 2026</w:t>
-      </w:r>
-    </w:p>
-    <w:p>
-      <w:r>
-        <w:br w:type="page"/>
-      </w:r>
-    </w:p>
-    <w:p>
-      <w:pPr>
-        <w:jc w:val="center"/>
-      </w:pPr>
+      <w:proofErr w:type="spellStart"/>
       <w:r>
         <w:rPr>
           <w:b/>
         </w:rPr>
         <w:lastRenderedPageBreak/>
-        <w:t>Tabla de contenido</w:t>
-      </w:r>
+        <w:t>Tabla</w:t>
+      </w:r>
+      <w:proofErr w:type="spellEnd"/>
+      <w:r>
+        <w:rPr>
+          <w:b/>
+        </w:rPr>
+        <w:t xml:space="preserve"> de </w:t>
+      </w:r>
+      <w:proofErr w:type="spellStart"/>
+      <w:r>
+        <w:rPr>
+          <w:b/>
+        </w:rPr>
+        <w:t>contenido</w:t>
+      </w:r>
+      <w:proofErr w:type="spellEnd"/>
     </w:p>
     <w:p>
       <w:pPr>
@@ -1064,9 +1214,15 @@
       <w:pPr>
         <w:pStyle w:val="Heading1"/>
         <w:jc w:val="center"/>
+        <w:rPr>
+          <w:lang w:val="es-CO"/>
+        </w:rPr>
       </w:pPr>
       <w:bookmarkStart w:id="0" w:name="_Toc240212889"/>
       <w:r>
+        <w:rPr>
+          <w:lang w:val="es-CO"/>
+        </w:rPr>
         <w:lastRenderedPageBreak/>
         <w:t>Introducción</w:t>
       </w:r>
@@ -1075,19 +1231,84 @@
     <w:p>
       <w:pPr>
         <w:ind w:firstLine="720"/>
+        <w:rPr>
+          <w:lang w:val="es-CO"/>
+        </w:rPr>
       </w:pPr>
       <w:r>
-        <w:t>Este informe describe el proceso de limpieza que se le hizo al dataset Healthcare Dataset, descargado de Kaggle, y que se va a usar más adelante en el modelado. El conjunto tiene 55.500 registros de admisiones hospitalarias repartidos en 15 columnas, entre ellas datos del paciente, de la admisión y de la cuenta. En un primer vistazo el archivo parece estar bien, sobre todo porque no trae valores nulos, pero al revisarlo con más calma aparecen varios problemas de calidad: hay filas repetidas, nombres escrito</w:t>
-      </w:r>
-      <w:r>
-        <w:t>s con mayúsculas y minúsculas al azar y facturas con montos negativos, que no son válidos para un hospital.</w:t>
+        <w:rPr>
+          <w:lang w:val="es-CO"/>
+        </w:rPr>
+        <w:t xml:space="preserve">Este informe describe el proceso de limpieza que se le hizo al </w:t>
+      </w:r>
+      <w:proofErr w:type="spellStart"/>
+      <w:r>
+        <w:rPr>
+          <w:lang w:val="es-CO"/>
+        </w:rPr>
+        <w:t>dataset</w:t>
+      </w:r>
+      <w:proofErr w:type="spellEnd"/>
+      <w:r>
+        <w:rPr>
+          <w:lang w:val="es-CO"/>
+        </w:rPr>
+        <w:t xml:space="preserve"> </w:t>
+      </w:r>
+      <w:proofErr w:type="spellStart"/>
+      <w:r>
+        <w:rPr>
+          <w:lang w:val="es-CO"/>
+        </w:rPr>
+        <w:t>Healthcare</w:t>
+      </w:r>
+      <w:proofErr w:type="spellEnd"/>
+      <w:r>
+        <w:rPr>
+          <w:lang w:val="es-CO"/>
+        </w:rPr>
+        <w:t xml:space="preserve"> </w:t>
+      </w:r>
+      <w:proofErr w:type="spellStart"/>
+      <w:r>
+        <w:rPr>
+          <w:lang w:val="es-CO"/>
+        </w:rPr>
+        <w:t>Dataset</w:t>
+      </w:r>
+      <w:proofErr w:type="spellEnd"/>
+      <w:r>
+        <w:rPr>
+          <w:lang w:val="es-CO"/>
+        </w:rPr>
+        <w:t xml:space="preserve">, descargado de </w:t>
+      </w:r>
+      <w:proofErr w:type="spellStart"/>
+      <w:r>
+        <w:rPr>
+          <w:lang w:val="es-CO"/>
+        </w:rPr>
+        <w:t>Kaggle</w:t>
+      </w:r>
+      <w:proofErr w:type="spellEnd"/>
+      <w:r>
+        <w:rPr>
+          <w:lang w:val="es-CO"/>
+        </w:rPr>
+        <w:t>, y que se va a usar más adelante en el modelado. El conjunto tiene 55.500 registros de admisiones hospitalarias repartidos en 15 columnas, entre ellas datos del paciente, de la admisión y de la cuenta. En un primer vistazo el archivo parece estar bien, sobre todo porque no trae valores nulos, pero al revisarlo con más calma aparecen varios problemas de calidad: hay filas repetidas, nombres escritos con mayúsculas y minúsculas al azar y facturas con montos negativos, que no son válidos para un hospital.</w:t>
       </w:r>
     </w:p>
     <w:p>
       <w:pPr>
         <w:ind w:firstLine="720"/>
+        <w:rPr>
+          <w:lang w:val="es-CO"/>
+        </w:rPr>
       </w:pPr>
       <w:r>
+        <w:rPr>
+          <w:lang w:val="es-CO"/>
+        </w:rPr>
         <w:t>En el documento se muestra, en orden, el diagnóstico que se hizo sobre el archivo crudo, la corrección de cada problema encontrado y la validación con la que se comprobó el resultado antes de exportar el archivo limpio.</w:t>
       </w:r>
     </w:p>
@@ -1095,31 +1316,129 @@
       <w:pPr>
         <w:pStyle w:val="Heading1"/>
         <w:jc w:val="center"/>
+        <w:rPr>
+          <w:lang w:val="es-CO"/>
+        </w:rPr>
       </w:pPr>
       <w:bookmarkStart w:id="1" w:name="_Toc240212890"/>
       <w:r>
-        <w:t>Descripción del dataset</w:t>
+        <w:rPr>
+          <w:lang w:val="es-CO"/>
+        </w:rPr>
+        <w:t xml:space="preserve">Descripción del </w:t>
+      </w:r>
+      <w:proofErr w:type="spellStart"/>
+      <w:r>
+        <w:rPr>
+          <w:lang w:val="es-CO"/>
+        </w:rPr>
+        <w:t>dataset</w:t>
       </w:r>
       <w:bookmarkEnd w:id="1"/>
+      <w:proofErr w:type="spellEnd"/>
     </w:p>
     <w:p>
       <w:pPr>
         <w:ind w:firstLine="720"/>
+        <w:rPr>
+          <w:lang w:val="es-CO"/>
+        </w:rPr>
       </w:pPr>
       <w:r>
-        <w:t>Se escogió el Healthcare Dataset de prasad22 (2024) porque es un dataset público que se ve limpio, pero que igual que pasa con muchos datos reales esconde problemas que vale la pena buscar antes de usarlo. Cada fila es una admisión hospitalaria y las columnas son Name, Age, Gender, Blood Type, Medical Condition, Date of Admission, Doctor, Hospital, Insurance Provider, Billing Amount, Room Number, Admission Type, Discharge Date, Medication y Test Results. El trabajo sigue los pasos básicos del preprocesamien</w:t>
-      </w:r>
-      <w:r>
-        <w:t>to de datos (Han, Kamber y Pei, 2012): revisar la calidad, corregir los problemas encontrados y validar el resultado.</w:t>
+        <w:rPr>
+          <w:lang w:val="es-CO"/>
+        </w:rPr>
+        <w:t xml:space="preserve">Se escogió el </w:t>
+      </w:r>
+      <w:proofErr w:type="spellStart"/>
+      <w:r>
+        <w:rPr>
+          <w:lang w:val="es-CO"/>
+        </w:rPr>
+        <w:t>Healthcare</w:t>
+      </w:r>
+      <w:proofErr w:type="spellEnd"/>
+      <w:r>
+        <w:rPr>
+          <w:lang w:val="es-CO"/>
+        </w:rPr>
+        <w:t xml:space="preserve"> </w:t>
+      </w:r>
+      <w:proofErr w:type="spellStart"/>
+      <w:r>
+        <w:rPr>
+          <w:lang w:val="es-CO"/>
+        </w:rPr>
+        <w:t>Dataset</w:t>
+      </w:r>
+      <w:proofErr w:type="spellEnd"/>
+      <w:r>
+        <w:rPr>
+          <w:lang w:val="es-CO"/>
+        </w:rPr>
+        <w:t xml:space="preserve"> de prasad22 (2024) porque es un </w:t>
+      </w:r>
+      <w:proofErr w:type="spellStart"/>
+      <w:r>
+        <w:rPr>
+          <w:lang w:val="es-CO"/>
+        </w:rPr>
+        <w:t>dataset</w:t>
+      </w:r>
+      <w:proofErr w:type="spellEnd"/>
+      <w:r>
+        <w:rPr>
+          <w:lang w:val="es-CO"/>
+        </w:rPr>
+        <w:t xml:space="preserve"> público que se ve limpio, pero que igual que pasa con muchos datos reales esconde problemas que vale la pena buscar antes de usarlo. </w:t>
+      </w:r>
+      <w:r>
+        <w:t xml:space="preserve">Cada fila es </w:t>
+      </w:r>
+      <w:proofErr w:type="spellStart"/>
+      <w:r>
+        <w:t>una</w:t>
+      </w:r>
+      <w:proofErr w:type="spellEnd"/>
+      <w:r>
+        <w:t xml:space="preserve"> </w:t>
+      </w:r>
+      <w:proofErr w:type="spellStart"/>
+      <w:r>
+        <w:t>admisión</w:t>
+      </w:r>
+      <w:proofErr w:type="spellEnd"/>
+      <w:r>
+        <w:t xml:space="preserve"> </w:t>
+      </w:r>
+      <w:proofErr w:type="spellStart"/>
+      <w:r>
+        <w:t>hospitalaria</w:t>
+      </w:r>
+      <w:proofErr w:type="spellEnd"/>
+      <w:r>
+        <w:t xml:space="preserve"> y las columnas son Name, Age, Gender, Blood Type, Medical Condition, Date of Admission, Doctor, Hospital, Insurance Provider, Billing Amount, Room Number, Admission Type, Discharge Date, Medication y Test Results. </w:t>
+      </w:r>
+      <w:r>
+        <w:rPr>
+          <w:lang w:val="es-CO"/>
+        </w:rPr>
+        <w:t>El trabajo sigue los pasos básicos del preprocesamiento de datos (Han, Kamber y Pei, 2012): revisar la calidad, corregir los problemas encontrados y validar el resultado.</w:t>
       </w:r>
     </w:p>
     <w:p>
       <w:pPr>
         <w:pStyle w:val="Heading1"/>
         <w:jc w:val="center"/>
+        <w:rPr>
+          <w:lang w:val="es-CO"/>
+        </w:rPr>
       </w:pPr>
       <w:bookmarkStart w:id="2" w:name="_Toc240212891"/>
       <w:r>
+        <w:rPr>
+          <w:lang w:val="es-CO"/>
+        </w:rPr>
         <w:t>Diagnóstico inicial</w:t>
       </w:r>
       <w:bookmarkEnd w:id="2"/>
@@ -1127,19 +1446,101 @@
     <w:p>
       <w:pPr>
         <w:ind w:firstLine="720"/>
+        <w:rPr>
+          <w:lang w:val="es-CO"/>
+        </w:rPr>
       </w:pPr>
       <w:r>
-        <w:t>El primer paso fue responder las tres preguntas con las que se revisa cualquier dataset: cuánto falta, qué está repetido y qué se sale de rango. Para eso se usaron isna(), duplicated() y describe() sobre el archivo crudo. El resultado del diagnóstico fue el siguiente.</w:t>
+        <w:rPr>
+          <w:lang w:val="es-CO"/>
+        </w:rPr>
+        <w:t xml:space="preserve">El primer paso fue responder las tres preguntas con las que se revisa cualquier </w:t>
+      </w:r>
+      <w:proofErr w:type="spellStart"/>
+      <w:r>
+        <w:rPr>
+          <w:lang w:val="es-CO"/>
+        </w:rPr>
+        <w:t>dataset</w:t>
+      </w:r>
+      <w:proofErr w:type="spellEnd"/>
+      <w:r>
+        <w:rPr>
+          <w:lang w:val="es-CO"/>
+        </w:rPr>
+        <w:t xml:space="preserve">: cuánto falta, qué está repetido y qué se sale de rango. Para eso se usaron </w:t>
+      </w:r>
+      <w:proofErr w:type="spellStart"/>
+      <w:proofErr w:type="gramStart"/>
+      <w:r>
+        <w:rPr>
+          <w:lang w:val="es-CO"/>
+        </w:rPr>
+        <w:t>isna</w:t>
+      </w:r>
+      <w:proofErr w:type="spellEnd"/>
+      <w:r>
+        <w:rPr>
+          <w:lang w:val="es-CO"/>
+        </w:rPr>
+        <w:t>(</w:t>
+      </w:r>
+      <w:proofErr w:type="gramEnd"/>
+      <w:r>
+        <w:rPr>
+          <w:lang w:val="es-CO"/>
+        </w:rPr>
+        <w:t xml:space="preserve">), </w:t>
+      </w:r>
+      <w:proofErr w:type="spellStart"/>
+      <w:proofErr w:type="gramStart"/>
+      <w:r>
+        <w:rPr>
+          <w:lang w:val="es-CO"/>
+        </w:rPr>
+        <w:t>duplicated</w:t>
+      </w:r>
+      <w:proofErr w:type="spellEnd"/>
+      <w:r>
+        <w:rPr>
+          <w:lang w:val="es-CO"/>
+        </w:rPr>
+        <w:t>(</w:t>
+      </w:r>
+      <w:proofErr w:type="gramEnd"/>
+      <w:r>
+        <w:rPr>
+          <w:lang w:val="es-CO"/>
+        </w:rPr>
+        <w:t xml:space="preserve">) y </w:t>
+      </w:r>
+      <w:proofErr w:type="gramStart"/>
+      <w:r>
+        <w:rPr>
+          <w:lang w:val="es-CO"/>
+        </w:rPr>
+        <w:t>describe(</w:t>
+      </w:r>
+      <w:proofErr w:type="gramEnd"/>
+      <w:r>
+        <w:rPr>
+          <w:lang w:val="es-CO"/>
+        </w:rPr>
+        <w:t>) sobre el archivo crudo. El resultado del diagnóstico fue el siguiente.</w:t>
       </w:r>
     </w:p>
     <w:p>
       <w:pPr>
         <w:spacing w:line="240" w:lineRule="auto"/>
         <w:jc w:val="center"/>
+        <w:rPr>
+          <w:lang w:val="es-CO"/>
+        </w:rPr>
       </w:pPr>
       <w:r>
         <w:rPr>
           <w:b/>
+          <w:lang w:val="es-CO"/>
         </w:rPr>
         <w:lastRenderedPageBreak/>
         <w:t>Tabla 1</w:t>
@@ -1147,14 +1548,32 @@
       <w:r>
         <w:rPr>
           <w:b/>
+          <w:lang w:val="es-CO"/>
         </w:rPr>
         <w:br/>
       </w:r>
       <w:r>
         <w:rPr>
           <w:i/>
-        </w:rPr>
-        <w:t>Diagnóstico del dataset crudo</w:t>
+          <w:lang w:val="es-CO"/>
+        </w:rPr>
+        <w:t xml:space="preserve">Diagnóstico del </w:t>
+      </w:r>
+      <w:proofErr w:type="spellStart"/>
+      <w:r>
+        <w:rPr>
+          <w:i/>
+          <w:lang w:val="es-CO"/>
+        </w:rPr>
+        <w:t>dataset</w:t>
+      </w:r>
+      <w:proofErr w:type="spellEnd"/>
+      <w:r>
+        <w:rPr>
+          <w:i/>
+          <w:lang w:val="es-CO"/>
+        </w:rPr>
+        <w:t xml:space="preserve"> crudo</w:t>
       </w:r>
     </w:p>
     <w:tbl>
@@ -1176,12 +1595,14 @@
             <w:pPr>
               <w:spacing w:line="240" w:lineRule="auto"/>
             </w:pPr>
+            <w:proofErr w:type="spellStart"/>
             <w:r>
               <w:rPr>
                 <w:b/>
               </w:rPr>
               <w:t>Chequeo</w:t>
             </w:r>
+            <w:proofErr w:type="spellEnd"/>
           </w:p>
         </w:tc>
         <w:tc>
@@ -1191,12 +1612,32 @@
           <w:p>
             <w:pPr>
               <w:spacing w:line="240" w:lineRule="auto"/>
+              <w:rPr>
+                <w:lang w:val="es-CO"/>
+              </w:rPr>
             </w:pPr>
             <w:r>
               <w:rPr>
                 <w:b/>
+                <w:lang w:val="es-CO"/>
               </w:rPr>
-              <w:t>Resultado en el dataset crudo</w:t>
+              <w:t xml:space="preserve">Resultado en el </w:t>
+            </w:r>
+            <w:proofErr w:type="spellStart"/>
+            <w:r>
+              <w:rPr>
+                <w:b/>
+                <w:lang w:val="es-CO"/>
+              </w:rPr>
+              <w:t>dataset</w:t>
+            </w:r>
+            <w:proofErr w:type="spellEnd"/>
+            <w:r>
+              <w:rPr>
+                <w:b/>
+                <w:lang w:val="es-CO"/>
+              </w:rPr>
+              <w:t xml:space="preserve"> crudo</w:t>
             </w:r>
           </w:p>
         </w:tc>
@@ -1211,8 +1652,13 @@
               <w:spacing w:line="240" w:lineRule="auto"/>
             </w:pPr>
             <w:r>
-              <w:t>Filas totales</w:t>
+              <w:t xml:space="preserve">Filas </w:t>
             </w:r>
+            <w:proofErr w:type="spellStart"/>
+            <w:r>
+              <w:t>totales</w:t>
+            </w:r>
+            <w:proofErr w:type="spellEnd"/>
           </w:p>
         </w:tc>
         <w:tc>
@@ -1239,8 +1685,13 @@
               <w:spacing w:line="240" w:lineRule="auto"/>
             </w:pPr>
             <w:r>
-              <w:t>Valores nulos</w:t>
+              <w:t xml:space="preserve">Valores </w:t>
             </w:r>
+            <w:proofErr w:type="spellStart"/>
+            <w:r>
+              <w:t>nulos</w:t>
+            </w:r>
+            <w:proofErr w:type="spellEnd"/>
           </w:p>
         </w:tc>
         <w:tc>
@@ -1252,7 +1703,15 @@
               <w:spacing w:line="240" w:lineRule="auto"/>
             </w:pPr>
             <w:r>
-              <w:t>0 (en las 15 columnas)</w:t>
+              <w:t>0 (</w:t>
+            </w:r>
+            <w:proofErr w:type="spellStart"/>
+            <w:r>
+              <w:t>en</w:t>
+            </w:r>
+            <w:proofErr w:type="spellEnd"/>
+            <w:r>
+              <w:t xml:space="preserve"> las 15 columnas)</w:t>
             </w:r>
           </w:p>
         </w:tc>
@@ -1267,7 +1726,15 @@
               <w:spacing w:line="240" w:lineRule="auto"/>
             </w:pPr>
             <w:r>
-              <w:t>Filas duplicadas exactas</w:t>
+              <w:t xml:space="preserve">Filas </w:t>
+            </w:r>
+            <w:proofErr w:type="spellStart"/>
+            <w:r>
+              <w:t>duplicadas</w:t>
+            </w:r>
+            <w:proofErr w:type="spellEnd"/>
+            <w:r>
+              <w:t xml:space="preserve"> exactas</w:t>
             </w:r>
           </w:p>
         </w:tc>
@@ -1307,8 +1774,21 @@
             <w:pPr>
               <w:spacing w:line="240" w:lineRule="auto"/>
             </w:pPr>
+            <w:proofErr w:type="spellStart"/>
             <w:r>
-              <w:t>Mínimo -2.008,49 y máximo 52.764,28</w:t>
+              <w:t>Mínimo</w:t>
+            </w:r>
+            <w:proofErr w:type="spellEnd"/>
+            <w:r>
+              <w:t xml:space="preserve"> -2.008,49 y </w:t>
+            </w:r>
+            <w:proofErr w:type="spellStart"/>
+            <w:r>
+              <w:t>máximo</w:t>
+            </w:r>
+            <w:proofErr w:type="spellEnd"/>
+            <w:r>
+              <w:t xml:space="preserve"> 52.764,28</w:t>
             </w:r>
           </w:p>
         </w:tc>
@@ -1336,8 +1816,21 @@
               <w:spacing w:line="240" w:lineRule="auto"/>
             </w:pPr>
             <w:r>
-              <w:t>13 a 89 años</w:t>
+              <w:t xml:space="preserve">13 </w:t>
             </w:r>
+            <w:proofErr w:type="gramStart"/>
+            <w:r>
+              <w:t>a</w:t>
+            </w:r>
+            <w:proofErr w:type="gramEnd"/>
+            <w:r>
+              <w:t xml:space="preserve"> 89 </w:t>
+            </w:r>
+            <w:proofErr w:type="spellStart"/>
+            <w:r>
+              <w:t>años</w:t>
+            </w:r>
+            <w:proofErr w:type="spellEnd"/>
           </w:p>
         </w:tc>
       </w:tr>
@@ -1364,7 +1857,21 @@
               <w:spacing w:line="240" w:lineRule="auto"/>
             </w:pPr>
             <w:r>
-              <w:t>Mayúsculas mezcladas al azar (ej. Bobby JacksOn)</w:t>
+              <w:rPr>
+                <w:lang w:val="es-CO"/>
+              </w:rPr>
+              <w:t xml:space="preserve">Mayúsculas mezcladas al azar (ej. </w:t>
+            </w:r>
+            <w:r>
+              <w:t xml:space="preserve">Bobby </w:t>
+            </w:r>
+            <w:proofErr w:type="spellStart"/>
+            <w:r>
+              <w:t>JacksOn</w:t>
+            </w:r>
+            <w:proofErr w:type="spellEnd"/>
+            <w:r>
+              <w:t>)</w:t>
             </w:r>
           </w:p>
         </w:tc>
@@ -1373,18 +1880,94 @@
     <w:p>
       <w:pPr>
         <w:ind w:firstLine="720"/>
+        <w:rPr>
+          <w:lang w:val="es-CO"/>
+        </w:rPr>
       </w:pPr>
       <w:r>
-        <w:t>Hay dos datos que llaman la atención: el mínimo de Billing Amount es negativo, lo que no tiene lógica para una factura, y hay más de 500 filas repetidas. En cambio, columnas como Gender, Blood Type o Admission Type ya llegaban con categorías uniformes; eso se verificó con unique() en cada una.</w:t>
+        <w:rPr>
+          <w:lang w:val="es-CO"/>
+        </w:rPr>
+        <w:t xml:space="preserve">Hay dos datos que llaman la atención: el mínimo de Billing </w:t>
+      </w:r>
+      <w:proofErr w:type="spellStart"/>
+      <w:r>
+        <w:rPr>
+          <w:lang w:val="es-CO"/>
+        </w:rPr>
+        <w:t>Amount</w:t>
+      </w:r>
+      <w:proofErr w:type="spellEnd"/>
+      <w:r>
+        <w:rPr>
+          <w:lang w:val="es-CO"/>
+        </w:rPr>
+        <w:t xml:space="preserve"> es negativo, lo que no tiene lógica para una factura, y hay más de 500 filas repetidas. En cambio, columnas como Gender, Blood Type o </w:t>
+      </w:r>
+      <w:proofErr w:type="spellStart"/>
+      <w:r>
+        <w:rPr>
+          <w:lang w:val="es-CO"/>
+        </w:rPr>
+        <w:t>Admission</w:t>
+      </w:r>
+      <w:proofErr w:type="spellEnd"/>
+      <w:r>
+        <w:rPr>
+          <w:lang w:val="es-CO"/>
+        </w:rPr>
+        <w:t xml:space="preserve"> </w:t>
+      </w:r>
+      <w:proofErr w:type="spellStart"/>
+      <w:r>
+        <w:rPr>
+          <w:lang w:val="es-CO"/>
+        </w:rPr>
+        <w:t>Type</w:t>
+      </w:r>
+      <w:proofErr w:type="spellEnd"/>
+      <w:r>
+        <w:rPr>
+          <w:lang w:val="es-CO"/>
+        </w:rPr>
+        <w:t xml:space="preserve"> ya llegaban con categorías uniformes; eso se verificó con </w:t>
+      </w:r>
+      <w:proofErr w:type="spellStart"/>
+      <w:proofErr w:type="gramStart"/>
+      <w:r>
+        <w:rPr>
+          <w:lang w:val="es-CO"/>
+        </w:rPr>
+        <w:t>unique</w:t>
+      </w:r>
+      <w:proofErr w:type="spellEnd"/>
+      <w:r>
+        <w:rPr>
+          <w:lang w:val="es-CO"/>
+        </w:rPr>
+        <w:t>(</w:t>
+      </w:r>
+      <w:proofErr w:type="gramEnd"/>
+      <w:r>
+        <w:rPr>
+          <w:lang w:val="es-CO"/>
+        </w:rPr>
+        <w:t>) en cada una.</w:t>
       </w:r>
     </w:p>
     <w:p>
       <w:pPr>
         <w:pStyle w:val="Heading1"/>
         <w:jc w:val="center"/>
+        <w:rPr>
+          <w:lang w:val="es-CO"/>
+        </w:rPr>
       </w:pPr>
       <w:bookmarkStart w:id="3" w:name="_Toc240212892"/>
       <w:r>
+        <w:rPr>
+          <w:lang w:val="es-CO"/>
+        </w:rPr>
         <w:t>Duplicados</w:t>
       </w:r>
       <w:bookmarkEnd w:id="3"/>
@@ -1392,18 +1975,72 @@
     <w:p>
       <w:pPr>
         <w:ind w:firstLine="720"/>
+        <w:rPr>
+          <w:lang w:val="es-CO"/>
+        </w:rPr>
       </w:pPr>
       <w:r>
-        <w:t>Se encontraron 534 filas repetidas exactas y se eliminaron con drop_duplicates(). Esto se hizo al principio, antes de calcular cualquier mediana o proporción, porque si se dejan, esos registros se cuentan doble y arruinan las correcciones de los pasos siguientes. Como el dataset no trae una columna de identificación, la comparación se hizo sobre la fila completa. Después de este paso el dataset quedó en 54.966 filas.</w:t>
+        <w:rPr>
+          <w:lang w:val="es-CO"/>
+        </w:rPr>
+        <w:t xml:space="preserve">Se encontraron 534 filas repetidas exactas y se eliminaron con </w:t>
+      </w:r>
+      <w:proofErr w:type="spellStart"/>
+      <w:r>
+        <w:rPr>
+          <w:lang w:val="es-CO"/>
+        </w:rPr>
+        <w:t>drop_duplicates</w:t>
+      </w:r>
+      <w:proofErr w:type="spellEnd"/>
+      <w:r>
+        <w:rPr>
+          <w:lang w:val="es-CO"/>
+        </w:rPr>
+        <w:t xml:space="preserve">(). Esto se hizo al principio, antes de calcular cualquier mediana o proporción, porque si se dejan, esos registros se cuentan doble y arruinan las correcciones de los pasos siguientes. Como el </w:t>
+      </w:r>
+      <w:proofErr w:type="spellStart"/>
+      <w:r>
+        <w:rPr>
+          <w:lang w:val="es-CO"/>
+        </w:rPr>
+        <w:t>dataset</w:t>
+      </w:r>
+      <w:proofErr w:type="spellEnd"/>
+      <w:r>
+        <w:rPr>
+          <w:lang w:val="es-CO"/>
+        </w:rPr>
+        <w:t xml:space="preserve"> no trae una columna de identificación, la comparación se hizo sobre la fila completa. Después de este paso el </w:t>
+      </w:r>
+      <w:proofErr w:type="spellStart"/>
+      <w:r>
+        <w:rPr>
+          <w:lang w:val="es-CO"/>
+        </w:rPr>
+        <w:t>dataset</w:t>
+      </w:r>
+      <w:proofErr w:type="spellEnd"/>
+      <w:r>
+        <w:rPr>
+          <w:lang w:val="es-CO"/>
+        </w:rPr>
+        <w:t xml:space="preserve"> quedó en 54.966 filas.</w:t>
       </w:r>
     </w:p>
     <w:p>
       <w:pPr>
         <w:pStyle w:val="Heading1"/>
         <w:jc w:val="center"/>
+        <w:rPr>
+          <w:lang w:val="es-CO"/>
+        </w:rPr>
       </w:pPr>
       <w:bookmarkStart w:id="4" w:name="_Toc240212893"/>
       <w:r>
+        <w:rPr>
+          <w:lang w:val="es-CO"/>
+        </w:rPr>
         <w:t>Normalización de textos</w:t>
       </w:r>
       <w:bookmarkEnd w:id="4"/>
@@ -1411,14 +2048,134 @@
     <w:p>
       <w:pPr>
         <w:ind w:firstLine="720"/>
+        <w:rPr>
+          <w:lang w:val="es-CO"/>
+        </w:rPr>
       </w:pPr>
       <w:r>
-        <w:t>Las columnas Name, Doctor y Hospital traen los nombres con las mayúsculas y minúsculas revueltas dentro de la misma palabra, por ejemplo LesLie TErRy o andrEw waTtS. Esto es un problema porque una búsqueda exacta no encuentra el mismo nombre escrito de dos formas y porque puede tapar duplicados que solo se diferencian por la capitalización. Las tres columnas se normalizaron con strip() y title(), que deja cada palabra con su primera letra en mayúscula. No se usó un mapa de reemplazos como el que se emplea p</w:t>
-      </w:r>
-      <w:r>
-        <w:t xml:space="preserve">ara ciudades en clase, </w:t>
-      </w:r>
-      <w:r>
+        <w:rPr>
+          <w:lang w:val="es-CO"/>
+        </w:rPr>
+        <w:t xml:space="preserve">Las columnas Name, Doctor y Hospital traen los nombres con las mayúsculas y minúsculas revueltas dentro de la misma palabra, por </w:t>
+      </w:r>
+      <w:proofErr w:type="gramStart"/>
+      <w:r>
+        <w:rPr>
+          <w:lang w:val="es-CO"/>
+        </w:rPr>
+        <w:t>ejemplo</w:t>
+      </w:r>
+      <w:proofErr w:type="gramEnd"/>
+      <w:r>
+        <w:rPr>
+          <w:lang w:val="es-CO"/>
+        </w:rPr>
+        <w:t xml:space="preserve"> </w:t>
+      </w:r>
+      <w:proofErr w:type="spellStart"/>
+      <w:r>
+        <w:rPr>
+          <w:lang w:val="es-CO"/>
+        </w:rPr>
+        <w:t>LesLie</w:t>
+      </w:r>
+      <w:proofErr w:type="spellEnd"/>
+      <w:r>
+        <w:rPr>
+          <w:lang w:val="es-CO"/>
+        </w:rPr>
+        <w:t xml:space="preserve"> </w:t>
+      </w:r>
+      <w:proofErr w:type="spellStart"/>
+      <w:r>
+        <w:rPr>
+          <w:lang w:val="es-CO"/>
+        </w:rPr>
+        <w:t>TErRy</w:t>
+      </w:r>
+      <w:proofErr w:type="spellEnd"/>
+      <w:r>
+        <w:rPr>
+          <w:lang w:val="es-CO"/>
+        </w:rPr>
+        <w:t xml:space="preserve"> o </w:t>
+      </w:r>
+      <w:proofErr w:type="spellStart"/>
+      <w:r>
+        <w:rPr>
+          <w:lang w:val="es-CO"/>
+        </w:rPr>
+        <w:t>andrEw</w:t>
+      </w:r>
+      <w:proofErr w:type="spellEnd"/>
+      <w:r>
+        <w:rPr>
+          <w:lang w:val="es-CO"/>
+        </w:rPr>
+        <w:t xml:space="preserve"> </w:t>
+      </w:r>
+      <w:proofErr w:type="spellStart"/>
+      <w:r>
+        <w:rPr>
+          <w:lang w:val="es-CO"/>
+        </w:rPr>
+        <w:t>waTtS</w:t>
+      </w:r>
+      <w:proofErr w:type="spellEnd"/>
+      <w:r>
+        <w:rPr>
+          <w:lang w:val="es-CO"/>
+        </w:rPr>
+        <w:t xml:space="preserve">. Esto es un problema porque una búsqueda exacta no encuentra el mismo nombre escrito de dos formas y porque puede tapar duplicados que solo se diferencian por la capitalización. Las tres columnas se normalizaron con </w:t>
+      </w:r>
+      <w:proofErr w:type="spellStart"/>
+      <w:proofErr w:type="gramStart"/>
+      <w:r>
+        <w:rPr>
+          <w:lang w:val="es-CO"/>
+        </w:rPr>
+        <w:t>strip</w:t>
+      </w:r>
+      <w:proofErr w:type="spellEnd"/>
+      <w:r>
+        <w:rPr>
+          <w:lang w:val="es-CO"/>
+        </w:rPr>
+        <w:t>(</w:t>
+      </w:r>
+      <w:proofErr w:type="gramEnd"/>
+      <w:r>
+        <w:rPr>
+          <w:lang w:val="es-CO"/>
+        </w:rPr>
+        <w:t xml:space="preserve">) y </w:t>
+      </w:r>
+      <w:proofErr w:type="spellStart"/>
+      <w:proofErr w:type="gramStart"/>
+      <w:r>
+        <w:rPr>
+          <w:lang w:val="es-CO"/>
+        </w:rPr>
+        <w:t>title</w:t>
+      </w:r>
+      <w:proofErr w:type="spellEnd"/>
+      <w:r>
+        <w:rPr>
+          <w:lang w:val="es-CO"/>
+        </w:rPr>
+        <w:t>(</w:t>
+      </w:r>
+      <w:proofErr w:type="gramEnd"/>
+      <w:r>
+        <w:rPr>
+          <w:lang w:val="es-CO"/>
+        </w:rPr>
+        <w:t xml:space="preserve">), que deja cada palabra con su primera letra en mayúscula. No se usó un mapa de reemplazos como el que se emplea para ciudades en clase, </w:t>
+      </w:r>
+      <w:r>
+        <w:rPr>
+          <w:lang w:val="es-CO"/>
+        </w:rPr>
         <w:lastRenderedPageBreak/>
         <w:t>porque estos campos son texto libre y no un catálogo cerrado de valores; con corregir el formato es suficiente.</w:t>
       </w:r>
@@ -1427,9 +2184,15 @@
       <w:pPr>
         <w:pStyle w:val="Heading1"/>
         <w:jc w:val="center"/>
+        <w:rPr>
+          <w:lang w:val="es-CO"/>
+        </w:rPr>
       </w:pPr>
       <w:bookmarkStart w:id="5" w:name="_Toc240212894"/>
       <w:r>
+        <w:rPr>
+          <w:lang w:val="es-CO"/>
+        </w:rPr>
         <w:t>Facturación negativa (valores imposibles)</w:t>
       </w:r>
       <w:bookmarkEnd w:id="5"/>
@@ -1437,17 +2200,57 @@
     <w:p>
       <w:pPr>
         <w:ind w:firstLine="720"/>
+        <w:rPr>
+          <w:lang w:val="es-CO"/>
+        </w:rPr>
       </w:pPr>
       <w:r>
-        <w:t>El problema más importante del dataset son las facturas con Billing Amount negativo: son 106 después de quitar los duplicados (eran 108 en el archivo crudo). Una factura de hospital no puede ser negativa, así que el dato está roto de la misma forma que un faltante, aunque no sea un NaN. Para decidir cómo corregirlas se aplicó el mismo criterio con el que se clasifican los nulos en MCAR, MAR o MNAR: primero se revisó si la presencia del error depende de alguna otra variable.</w:t>
+        <w:rPr>
+          <w:lang w:val="es-CO"/>
+        </w:rPr>
+        <w:t xml:space="preserve">El problema más importante del </w:t>
+      </w:r>
+      <w:proofErr w:type="spellStart"/>
+      <w:r>
+        <w:rPr>
+          <w:lang w:val="es-CO"/>
+        </w:rPr>
+        <w:t>dataset</w:t>
+      </w:r>
+      <w:proofErr w:type="spellEnd"/>
+      <w:r>
+        <w:rPr>
+          <w:lang w:val="es-CO"/>
+        </w:rPr>
+        <w:t xml:space="preserve"> son las facturas con Billing </w:t>
+      </w:r>
+      <w:proofErr w:type="spellStart"/>
+      <w:r>
+        <w:rPr>
+          <w:lang w:val="es-CO"/>
+        </w:rPr>
+        <w:t>Amount</w:t>
+      </w:r>
+      <w:proofErr w:type="spellEnd"/>
+      <w:r>
+        <w:rPr>
+          <w:lang w:val="es-CO"/>
+        </w:rPr>
+        <w:t xml:space="preserve"> negativo: son 106 después de quitar los duplicados (eran 108 en el archivo crudo). Una factura de hospital no puede ser negativa, así que el dato está roto de la misma forma que un faltante, aunque no sea un NaN. Para decidir cómo corregirlas se aplicó el mismo criterio con el que se clasifican los nulos en MCAR, MAR o MNAR: primero se revisó si la presencia del error depende de alguna otra variable.</w:t>
       </w:r>
     </w:p>
     <w:p>
       <w:pPr>
         <w:pStyle w:val="Heading2"/>
+        <w:rPr>
+          <w:lang w:val="es-CO"/>
+        </w:rPr>
       </w:pPr>
       <w:bookmarkStart w:id="6" w:name="_Toc240212895"/>
       <w:r>
+        <w:rPr>
+          <w:lang w:val="es-CO"/>
+        </w:rPr>
         <w:t>Revisión del problema</w:t>
       </w:r>
       <w:bookmarkEnd w:id="6"/>
@@ -1456,22 +2259,28 @@
       <w:pPr>
         <w:spacing w:line="240" w:lineRule="auto"/>
         <w:jc w:val="center"/>
+        <w:rPr>
+          <w:lang w:val="es-CO"/>
+        </w:rPr>
       </w:pPr>
       <w:r>
         <w:rPr>
           <w:b/>
+          <w:lang w:val="es-CO"/>
         </w:rPr>
         <w:t>Tabla 2</w:t>
       </w:r>
       <w:r>
         <w:rPr>
           <w:b/>
+          <w:lang w:val="es-CO"/>
         </w:rPr>
         <w:br/>
       </w:r>
       <w:r>
         <w:rPr>
           <w:i/>
+          <w:lang w:val="es-CO"/>
         </w:rPr>
         <w:t>Distribución de las facturas negativas por tipo de admisión</w:t>
       </w:r>
@@ -1500,8 +2309,16 @@
               <w:rPr>
                 <w:b/>
               </w:rPr>
-              <w:t>Tipo de admisión</w:t>
+              <w:t xml:space="preserve">Tipo de </w:t>
             </w:r>
+            <w:proofErr w:type="spellStart"/>
+            <w:r>
+              <w:rPr>
+                <w:b/>
+              </w:rPr>
+              <w:t>admisión</w:t>
+            </w:r>
+            <w:proofErr w:type="spellEnd"/>
           </w:p>
         </w:tc>
         <w:tc>
@@ -1516,8 +2333,16 @@
               <w:rPr>
                 <w:b/>
               </w:rPr>
-              <w:t>En las facturas negativas</w:t>
+              <w:t xml:space="preserve">En las facturas </w:t>
             </w:r>
+            <w:proofErr w:type="spellStart"/>
+            <w:r>
+              <w:rPr>
+                <w:b/>
+              </w:rPr>
+              <w:t>negativas</w:t>
+            </w:r>
+            <w:proofErr w:type="spellEnd"/>
           </w:p>
         </w:tc>
         <w:tc>
@@ -1532,8 +2357,16 @@
               <w:rPr>
                 <w:b/>
               </w:rPr>
-              <w:t>En el dataset completo</w:t>
+              <w:t xml:space="preserve">En el dataset </w:t>
             </w:r>
+            <w:proofErr w:type="spellStart"/>
+            <w:r>
+              <w:rPr>
+                <w:b/>
+              </w:rPr>
+              <w:t>completo</w:t>
+            </w:r>
+            <w:proofErr w:type="spellEnd"/>
           </w:p>
         </w:tc>
       </w:tr>
@@ -1664,17 +2497,29 @@
     <w:p>
       <w:pPr>
         <w:ind w:firstLine="720"/>
+        <w:rPr>
+          <w:lang w:val="es-CO"/>
+        </w:rPr>
       </w:pPr>
       <w:r>
+        <w:rPr>
+          <w:lang w:val="es-CO"/>
+        </w:rPr>
         <w:t>Las proporciones son casi iguales y el mismo patrón se repite con la aseguradora y con la condición médica. Con eso se concluyó que el error no depende de ninguna variable observada, es decir, se comporta como un error al azar.</w:t>
       </w:r>
     </w:p>
     <w:p>
       <w:pPr>
         <w:pStyle w:val="Heading2"/>
+        <w:rPr>
+          <w:lang w:val="es-CO"/>
+        </w:rPr>
       </w:pPr>
       <w:bookmarkStart w:id="7" w:name="_Toc240212896"/>
       <w:r>
+        <w:rPr>
+          <w:lang w:val="es-CO"/>
+        </w:rPr>
         <w:t>Corrección aplicada</w:t>
       </w:r>
       <w:bookmarkEnd w:id="7"/>
@@ -1682,8 +2527,14 @@
     <w:p>
       <w:pPr>
         <w:ind w:firstLine="720"/>
+        <w:rPr>
+          <w:lang w:val="es-CO"/>
+        </w:rPr>
       </w:pPr>
       <w:r>
+        <w:rPr>
+          <w:lang w:val="es-CO"/>
+        </w:rPr>
         <w:t>Como el problema es un error al azar (MCAR), lo más seguro era corregir las facturas negativas con la mediana de los valores válidos (25.593,87) en vez de eliminar los registros, porque el resto de la información de la fila sigue siendo útil. Usar cero para reemplazar tampoco era una buena opción, porque distorsiona el promedio real de facturación.</w:t>
       </w:r>
     </w:p>
@@ -1691,19 +2542,39 @@
       <w:pPr>
         <w:pStyle w:val="Heading1"/>
         <w:jc w:val="center"/>
+        <w:rPr>
+          <w:lang w:val="es-CO"/>
+        </w:rPr>
       </w:pPr>
       <w:bookmarkStart w:id="8" w:name="_Toc240212897"/>
-      <w:r>
+      <w:proofErr w:type="spellStart"/>
+      <w:r>
+        <w:rPr>
+          <w:lang w:val="es-CO"/>
+        </w:rPr>
         <w:lastRenderedPageBreak/>
-        <w:t>Outliers con la regla IQR</w:t>
+        <w:t>Outliers</w:t>
+      </w:r>
+      <w:proofErr w:type="spellEnd"/>
+      <w:r>
+        <w:rPr>
+          <w:lang w:val="es-CO"/>
+        </w:rPr>
+        <w:t xml:space="preserve"> con la regla IQR</w:t>
       </w:r>
       <w:bookmarkEnd w:id="8"/>
     </w:p>
     <w:p>
       <w:pPr>
         <w:ind w:firstLine="720"/>
+        <w:rPr>
+          <w:lang w:val="es-CO"/>
+        </w:rPr>
       </w:pPr>
       <w:r>
+        <w:rPr>
+          <w:lang w:val="es-CO"/>
+        </w:rPr>
         <w:t>Después de corregir la facturación se revisaron las columnas numéricas con la regla de Tukey, que usa los cuartiles y el rango intercuartílico con un factor de 1.5.</w:t>
       </w:r>
     </w:p>
@@ -1711,22 +2582,28 @@
       <w:pPr>
         <w:spacing w:line="240" w:lineRule="auto"/>
         <w:jc w:val="center"/>
+        <w:rPr>
+          <w:lang w:val="es-CO"/>
+        </w:rPr>
       </w:pPr>
       <w:r>
         <w:rPr>
           <w:b/>
+          <w:lang w:val="es-CO"/>
         </w:rPr>
         <w:t>Tabla 3</w:t>
       </w:r>
       <w:r>
         <w:rPr>
           <w:b/>
+          <w:lang w:val="es-CO"/>
         </w:rPr>
         <w:br/>
       </w:r>
       <w:r>
         <w:rPr>
           <w:i/>
+          <w:lang w:val="es-CO"/>
         </w:rPr>
         <w:t>Límites de la regla IQR para las columnas numéricas</w:t>
       </w:r>
@@ -1818,11 +2695,19 @@
             <w:pPr>
               <w:spacing w:line="240" w:lineRule="auto"/>
             </w:pPr>
+            <w:proofErr w:type="spellStart"/>
             <w:r>
               <w:rPr>
                 <w:b/>
               </w:rPr>
-              <w:t>Límite inferior</w:t>
+              <w:t>Límite</w:t>
+            </w:r>
+            <w:proofErr w:type="spellEnd"/>
+            <w:r>
+              <w:rPr>
+                <w:b/>
+              </w:rPr>
+              <w:t xml:space="preserve"> inferior</w:t>
             </w:r>
           </w:p>
         </w:tc>
@@ -1834,11 +2719,19 @@
             <w:pPr>
               <w:spacing w:line="240" w:lineRule="auto"/>
             </w:pPr>
+            <w:proofErr w:type="spellStart"/>
             <w:r>
               <w:rPr>
                 <w:b/>
               </w:rPr>
-              <w:t>Límite superior</w:t>
+              <w:t>Límite</w:t>
+            </w:r>
+            <w:proofErr w:type="spellEnd"/>
+            <w:r>
+              <w:rPr>
+                <w:b/>
+              </w:rPr>
+              <w:t xml:space="preserve"> superior</w:t>
             </w:r>
           </w:p>
         </w:tc>
@@ -2007,21 +2900,58 @@
     <w:p>
       <w:pPr>
         <w:ind w:firstLine="720"/>
+        <w:rPr>
+          <w:lang w:val="es-CO"/>
+        </w:rPr>
       </w:pPr>
       <w:r>
-        <w:t>En las dos columnas no hubo ningún valor fuera de los límites, así que no fue necesario recortar nada. Un resultado interesante: el límite inferior de Billing Amount es -23.414,8, bastante por debajo del mínimo negativo real (-2.008,49). Eso quiere decir que la regla estadística jamás iba a detectar las facturas negativas como outliers, porque para la distribución del dato no son valores extremos; solo una regla de negocio como que una factura no puede ser negativa las puede atrapar. Por eso ese problema se</w:t>
-      </w:r>
-      <w:r>
-        <w:t xml:space="preserve"> trató aparte y no se dejó en manos del IQR.</w:t>
+        <w:rPr>
+          <w:lang w:val="es-CO"/>
+        </w:rPr>
+        <w:t xml:space="preserve">En las dos columnas no hubo ningún valor fuera de los límites, así que no fue necesario recortar nada. Un resultado interesante: el límite inferior de Billing </w:t>
+      </w:r>
+      <w:proofErr w:type="spellStart"/>
+      <w:r>
+        <w:rPr>
+          <w:lang w:val="es-CO"/>
+        </w:rPr>
+        <w:t>Amount</w:t>
+      </w:r>
+      <w:proofErr w:type="spellEnd"/>
+      <w:r>
+        <w:rPr>
+          <w:lang w:val="es-CO"/>
+        </w:rPr>
+        <w:t xml:space="preserve"> es -23.414,8, bastante por debajo del mínimo negativo real (-2.008,49). Eso quiere decir que la regla estadística jamás iba a detectar las facturas negativas como </w:t>
+      </w:r>
+      <w:proofErr w:type="spellStart"/>
+      <w:r>
+        <w:rPr>
+          <w:lang w:val="es-CO"/>
+        </w:rPr>
+        <w:t>outliers</w:t>
+      </w:r>
+      <w:proofErr w:type="spellEnd"/>
+      <w:r>
+        <w:rPr>
+          <w:lang w:val="es-CO"/>
+        </w:rPr>
+        <w:t>, porque para la distribución del dato no son valores extremos; solo una regla de negocio como que una factura no puede ser negativa las puede atrapar. Por eso ese problema se trató aparte y no se dejó en manos del IQR.</w:t>
       </w:r>
     </w:p>
     <w:p>
       <w:pPr>
         <w:pStyle w:val="Heading1"/>
         <w:jc w:val="center"/>
+        <w:rPr>
+          <w:lang w:val="es-CO"/>
+        </w:rPr>
       </w:pPr>
       <w:bookmarkStart w:id="9" w:name="_Toc240212898"/>
       <w:r>
+        <w:rPr>
+          <w:lang w:val="es-CO"/>
+        </w:rPr>
         <w:t>Validación final</w:t>
       </w:r>
       <w:bookmarkEnd w:id="9"/>
@@ -2029,8 +2959,14 @@
     <w:p>
       <w:pPr>
         <w:ind w:firstLine="720"/>
+        <w:rPr>
+          <w:lang w:val="es-CO"/>
+        </w:rPr>
       </w:pPr>
       <w:r>
+        <w:rPr>
+          <w:lang w:val="es-CO"/>
+        </w:rPr>
         <w:t>Antes de exportar el archivo se verificaron cuatro condiciones mínimas, y solo si todas se cumplen se genera el archivo limpio:</w:t>
       </w:r>
     </w:p>
@@ -2039,7 +2975,31 @@
         <w:pStyle w:val="ListBullet"/>
       </w:pPr>
       <w:r>
-        <w:t>No quedan filas duplicadas.</w:t>
+        <w:t xml:space="preserve">No </w:t>
+      </w:r>
+      <w:proofErr w:type="spellStart"/>
+      <w:r>
+        <w:t>quedan</w:t>
+      </w:r>
+      <w:proofErr w:type="spellEnd"/>
+      <w:r>
+        <w:t xml:space="preserve"> </w:t>
+      </w:r>
+      <w:proofErr w:type="spellStart"/>
+      <w:r>
+        <w:t>filas</w:t>
+      </w:r>
+      <w:proofErr w:type="spellEnd"/>
+      <w:r>
+        <w:t xml:space="preserve"> </w:t>
+      </w:r>
+      <w:proofErr w:type="spellStart"/>
+      <w:r>
+        <w:t>duplicadas</w:t>
+      </w:r>
+      <w:proofErr w:type="spellEnd"/>
+      <w:r>
+        <w:t>.</w:t>
       </w:r>
     </w:p>
     <w:p>
@@ -2047,7 +3007,31 @@
         <w:pStyle w:val="ListBullet"/>
       </w:pPr>
       <w:r>
-        <w:t>No quedan valores nulos.</w:t>
+        <w:t xml:space="preserve">No </w:t>
+      </w:r>
+      <w:proofErr w:type="spellStart"/>
+      <w:r>
+        <w:t>quedan</w:t>
+      </w:r>
+      <w:proofErr w:type="spellEnd"/>
+      <w:r>
+        <w:t xml:space="preserve"> </w:t>
+      </w:r>
+      <w:proofErr w:type="spellStart"/>
+      <w:r>
+        <w:t>valores</w:t>
+      </w:r>
+      <w:proofErr w:type="spellEnd"/>
+      <w:r>
+        <w:t xml:space="preserve"> </w:t>
+      </w:r>
+      <w:proofErr w:type="spellStart"/>
+      <w:r>
+        <w:t>nulos</w:t>
+      </w:r>
+      <w:proofErr w:type="spellEnd"/>
+      <w:r>
+        <w:t>.</w:t>
       </w:r>
     </w:p>
     <w:p>
@@ -2055,32 +3039,80 @@
         <w:pStyle w:val="ListBullet"/>
       </w:pPr>
       <w:r>
-        <w:t>No quedan facturas negativas.</w:t>
+        <w:t xml:space="preserve">No </w:t>
+      </w:r>
+      <w:proofErr w:type="spellStart"/>
+      <w:r>
+        <w:t>quedan</w:t>
+      </w:r>
+      <w:proofErr w:type="spellEnd"/>
+      <w:r>
+        <w:t xml:space="preserve"> facturas </w:t>
+      </w:r>
+      <w:proofErr w:type="spellStart"/>
+      <w:r>
+        <w:t>negativas</w:t>
+      </w:r>
+      <w:proofErr w:type="spellEnd"/>
+      <w:r>
+        <w:t>.</w:t>
       </w:r>
     </w:p>
     <w:p>
       <w:pPr>
         <w:pStyle w:val="ListBullet"/>
+        <w:rPr>
+          <w:lang w:val="es-CO"/>
+        </w:rPr>
       </w:pPr>
       <w:r>
+        <w:rPr>
+          <w:lang w:val="es-CO"/>
+        </w:rPr>
         <w:t>Las edades están dentro de un rango humano (0 a 120 años).</w:t>
       </w:r>
     </w:p>
     <w:p>
       <w:pPr>
         <w:ind w:firstLine="720"/>
+        <w:rPr>
+          <w:lang w:val="es-CO"/>
+        </w:rPr>
       </w:pPr>
       <w:r>
-        <w:t>Las cuatro condiciones se cumplieron, así que se exportó el archivo healthcare_dataset_limpio.csv. Si alguna hubiera fallado, no se habría generado el archivo para no dejar salir un dataset a medio corregir.</w:t>
+        <w:rPr>
+          <w:lang w:val="es-CO"/>
+        </w:rPr>
+        <w:t xml:space="preserve">Las cuatro condiciones se cumplieron, así que se exportó el archivo healthcare_dataset_limpio.csv. Si alguna hubiera fallado, no se habría generado el archivo para no dejar salir un </w:t>
+      </w:r>
+      <w:proofErr w:type="spellStart"/>
+      <w:r>
+        <w:rPr>
+          <w:lang w:val="es-CO"/>
+        </w:rPr>
+        <w:t>dataset</w:t>
+      </w:r>
+      <w:proofErr w:type="spellEnd"/>
+      <w:r>
+        <w:rPr>
+          <w:lang w:val="es-CO"/>
+        </w:rPr>
+        <w:t xml:space="preserve"> a medio corregir.</w:t>
       </w:r>
     </w:p>
     <w:p>
       <w:pPr>
         <w:pStyle w:val="Heading1"/>
         <w:jc w:val="center"/>
+        <w:rPr>
+          <w:lang w:val="es-CO"/>
+        </w:rPr>
       </w:pPr>
       <w:bookmarkStart w:id="10" w:name="_Toc240212899"/>
       <w:r>
+        <w:rPr>
+          <w:lang w:val="es-CO"/>
+        </w:rPr>
         <w:lastRenderedPageBreak/>
         <w:t>Resumen antes y después</w:t>
       </w:r>
@@ -2089,8 +3121,14 @@
     <w:p>
       <w:pPr>
         <w:ind w:firstLine="720"/>
+        <w:rPr>
+          <w:lang w:val="es-CO"/>
+        </w:rPr>
       </w:pPr>
       <w:r>
+        <w:rPr>
+          <w:lang w:val="es-CO"/>
+        </w:rPr>
         <w:t>El resumen de lo que cambió durante la limpieza es el siguiente.</w:t>
       </w:r>
     </w:p>
@@ -2098,24 +3136,46 @@
       <w:pPr>
         <w:spacing w:line="240" w:lineRule="auto"/>
         <w:jc w:val="center"/>
+        <w:rPr>
+          <w:lang w:val="es-CO"/>
+        </w:rPr>
       </w:pPr>
       <w:r>
         <w:rPr>
           <w:b/>
+          <w:lang w:val="es-CO"/>
         </w:rPr>
         <w:t>Tabla 4</w:t>
       </w:r>
       <w:r>
         <w:rPr>
           <w:b/>
+          <w:lang w:val="es-CO"/>
         </w:rPr>
         <w:br/>
       </w:r>
       <w:r>
         <w:rPr>
           <w:i/>
-        </w:rPr>
-        <w:t>Comparación del dataset antes y después de la limpieza</w:t>
+          <w:lang w:val="es-CO"/>
+        </w:rPr>
+        <w:t xml:space="preserve">Comparación del </w:t>
+      </w:r>
+      <w:proofErr w:type="spellStart"/>
+      <w:r>
+        <w:rPr>
+          <w:i/>
+          <w:lang w:val="es-CO"/>
+        </w:rPr>
+        <w:t>dataset</w:t>
+      </w:r>
+      <w:proofErr w:type="spellEnd"/>
+      <w:r>
+        <w:rPr>
+          <w:i/>
+          <w:lang w:val="es-CO"/>
+        </w:rPr>
+        <w:t xml:space="preserve"> antes y después de la limpieza</w:t>
       </w:r>
     </w:p>
     <w:tbl>
@@ -2138,12 +3198,14 @@
             <w:pPr>
               <w:spacing w:line="240" w:lineRule="auto"/>
             </w:pPr>
+            <w:proofErr w:type="spellStart"/>
             <w:r>
               <w:rPr>
                 <w:b/>
               </w:rPr>
               <w:t>Indicador</w:t>
             </w:r>
+            <w:proofErr w:type="spellEnd"/>
           </w:p>
         </w:tc>
         <w:tc>
@@ -2170,12 +3232,14 @@
             <w:pPr>
               <w:spacing w:line="240" w:lineRule="auto"/>
             </w:pPr>
+            <w:proofErr w:type="spellStart"/>
             <w:r>
               <w:rPr>
                 <w:b/>
               </w:rPr>
               <w:t>Después</w:t>
             </w:r>
+            <w:proofErr w:type="spellEnd"/>
           </w:p>
         </w:tc>
       </w:tr>
@@ -2230,8 +3294,13 @@
               <w:spacing w:line="240" w:lineRule="auto"/>
             </w:pPr>
             <w:r>
-              <w:t>Filas duplicadas</w:t>
+              <w:t xml:space="preserve">Filas </w:t>
             </w:r>
+            <w:proofErr w:type="spellStart"/>
+            <w:r>
+              <w:t>duplicadas</w:t>
+            </w:r>
+            <w:proofErr w:type="spellEnd"/>
           </w:p>
         </w:tc>
         <w:tc>
@@ -2271,8 +3340,13 @@
               <w:spacing w:line="240" w:lineRule="auto"/>
             </w:pPr>
             <w:r>
-              <w:t>Valores nulos</w:t>
+              <w:t xml:space="preserve">Valores </w:t>
             </w:r>
+            <w:proofErr w:type="spellStart"/>
+            <w:r>
+              <w:t>nulos</w:t>
+            </w:r>
+            <w:proofErr w:type="spellEnd"/>
           </w:p>
         </w:tc>
         <w:tc>
@@ -2312,8 +3386,13 @@
               <w:spacing w:line="240" w:lineRule="auto"/>
             </w:pPr>
             <w:r>
-              <w:t>Facturas negativas</w:t>
+              <w:t xml:space="preserve">Facturas </w:t>
             </w:r>
+            <w:proofErr w:type="spellStart"/>
+            <w:r>
+              <w:t>negativas</w:t>
+            </w:r>
+            <w:proofErr w:type="spellEnd"/>
           </w:p>
         </w:tc>
         <w:tc>
@@ -2352,9 +3431,27 @@
             <w:pPr>
               <w:spacing w:line="240" w:lineRule="auto"/>
             </w:pPr>
+            <w:proofErr w:type="spellStart"/>
             <w:r>
-              <w:t>Nombres con mayúsculas revueltas</w:t>
+              <w:t>Nombres</w:t>
             </w:r>
+            <w:proofErr w:type="spellEnd"/>
+            <w:r>
+              <w:t xml:space="preserve"> con </w:t>
+            </w:r>
+            <w:proofErr w:type="spellStart"/>
+            <w:r>
+              <w:t>mayúsculas</w:t>
+            </w:r>
+            <w:proofErr w:type="spellEnd"/>
+            <w:r>
+              <w:t xml:space="preserve"> </w:t>
+            </w:r>
+            <w:proofErr w:type="spellStart"/>
+            <w:r>
+              <w:t>revueltas</w:t>
+            </w:r>
+            <w:proofErr w:type="spellEnd"/>
           </w:p>
         </w:tc>
         <w:tc>
@@ -2365,9 +3462,11 @@
             <w:pPr>
               <w:spacing w:line="240" w:lineRule="auto"/>
             </w:pPr>
+            <w:proofErr w:type="spellStart"/>
             <w:r>
               <w:t>Sí</w:t>
             </w:r>
+            <w:proofErr w:type="spellEnd"/>
           </w:p>
         </w:tc>
         <w:tc>
@@ -2392,9 +3491,23 @@
           <w:p>
             <w:pPr>
               <w:spacing w:line="240" w:lineRule="auto"/>
+              <w:rPr>
+                <w:lang w:val="es-CO"/>
+              </w:rPr>
             </w:pPr>
+            <w:proofErr w:type="spellStart"/>
             <w:r>
-              <w:t>Outliers según la regla IQR</w:t>
+              <w:rPr>
+                <w:lang w:val="es-CO"/>
+              </w:rPr>
+              <w:t>Outliers</w:t>
+            </w:r>
+            <w:proofErr w:type="spellEnd"/>
+            <w:r>
+              <w:rPr>
+                <w:lang w:val="es-CO"/>
+              </w:rPr>
+              <w:t xml:space="preserve"> según la regla IQR</w:t>
             </w:r>
           </w:p>
         </w:tc>
@@ -2429,8 +3542,14 @@
     <w:p>
       <w:pPr>
         <w:ind w:firstLine="720"/>
+        <w:rPr>
+          <w:lang w:val="es-CO"/>
+        </w:rPr>
       </w:pPr>
       <w:r>
+        <w:rPr>
+          <w:lang w:val="es-CO"/>
+        </w:rPr>
         <w:t>Un detalle sobre las facturas negativas: al quitar los duplicados quedaron 106 por corregir y no 108, porque dos de las negativas estaban entre las filas repetidas. Eso muestra otro motivo por el que el orden del proceso importa.</w:t>
       </w:r>
     </w:p>
@@ -2438,9 +3557,15 @@
       <w:pPr>
         <w:pStyle w:val="Heading1"/>
         <w:jc w:val="center"/>
+        <w:rPr>
+          <w:lang w:val="es-CO"/>
+        </w:rPr>
       </w:pPr>
       <w:bookmarkStart w:id="11" w:name="_Toc240212900"/>
       <w:r>
+        <w:rPr>
+          <w:lang w:val="es-CO"/>
+        </w:rPr>
         <w:t>Conclusiones</w:t>
       </w:r>
       <w:bookmarkEnd w:id="11"/>
@@ -2448,45 +3573,57 @@
     <w:p>
       <w:pPr>
         <w:ind w:firstLine="720"/>
+        <w:rPr>
+          <w:lang w:val="es-CO"/>
+        </w:rPr>
       </w:pPr>
       <w:r>
-        <w:t>La limpieza dejó el dataset en 54.966 filas, sin duplicados, sin nulos y sin facturas negativas. La primera conclusión es que un dataset con cero nulos puede seguir estando sucio: la calidad no se mide solo contando NaN. La segunda es que el mismo marco que se usa para clasificar los nulos (MCAR, MAR y MNAR) sirve para decidir qué hacer con valores presentes pero imposibles, como la facturación negativa: primero se revisa si el error depende de algo y luego se elige el método.</w:t>
+        <w:rPr>
+          <w:lang w:val="es-CO"/>
+        </w:rPr>
+        <w:t xml:space="preserve">La limpieza dejó el </w:t>
+      </w:r>
+      <w:proofErr w:type="spellStart"/>
+      <w:r>
+        <w:rPr>
+          <w:lang w:val="es-CO"/>
+        </w:rPr>
+        <w:t>dataset</w:t>
+      </w:r>
+      <w:proofErr w:type="spellEnd"/>
+      <w:r>
+        <w:rPr>
+          <w:lang w:val="es-CO"/>
+        </w:rPr>
+        <w:t xml:space="preserve"> en 54.966 filas, sin duplicados, sin nulos y sin facturas negativas. La primera conclusión es que un </w:t>
+      </w:r>
+      <w:proofErr w:type="spellStart"/>
+      <w:r>
+        <w:rPr>
+          <w:lang w:val="es-CO"/>
+        </w:rPr>
+        <w:t>dataset</w:t>
+      </w:r>
+      <w:proofErr w:type="spellEnd"/>
+      <w:r>
+        <w:rPr>
+          <w:lang w:val="es-CO"/>
+        </w:rPr>
+        <w:t xml:space="preserve"> con cero nulos puede seguir estando sucio: la calidad no se mide solo contando NaN. La segunda es que el mismo marco que se usa para clasificar los nulos (MCAR, MAR y MNAR) sirve para decidir qué hacer con valores presentes pero imposibles, como la facturación negativa: primero se revisa si el error depende de algo y luego se elige el método.</w:t>
       </w:r>
     </w:p>
     <w:p>
       <w:pPr>
         <w:ind w:firstLine="720"/>
+        <w:rPr>
+          <w:lang w:val="es-CO"/>
+        </w:rPr>
       </w:pPr>
       <w:r>
+        <w:rPr>
+          <w:lang w:val="es-CO"/>
+        </w:rPr>
         <w:t>La tercera es que la estadística por sí sola no basta; el IQR no detectó las facturas negativas porque no son extremos para la distribución, y por eso hacen falta las reglas de negocio. Al final, cada corrección quedó registrada en la salida del script, indicando la columna, el método usado y la cantidad de valores afectados, para poder explicar por qué se hizo.</w:t>
-      </w:r>
-    </w:p>
-    <w:p>
-      <w:pPr>
-        <w:pStyle w:val="Heading1"/>
-        <w:jc w:val="center"/>
-      </w:pPr>
-      <w:bookmarkStart w:id="12" w:name="_Toc240212901"/>
-      <w:r>
-        <w:t>Referencias</w:t>
-      </w:r>
-      <w:bookmarkEnd w:id="12"/>
-    </w:p>
-    <w:p>
-      <w:pPr>
-        <w:ind w:left="720" w:hanging="720"/>
-      </w:pPr>
-      <w:r>
-        <w:t>Han, J., Kamber, M. y Pei, J. (2012). Data mining: Concepts and techniques (3.ª ed.). Elsevier.</w:t>
-      </w:r>
-    </w:p>
-    <w:p>
-      <w:pPr>
-        <w:ind w:left="720" w:hanging="720"/>
-      </w:pPr>
-      <w:r>
-        <w:lastRenderedPageBreak/>
-        <w:t>prasad22. (2024). Healthcare dataset [Conjunto de datos]. Kaggle. https://www.kaggle.com/datasets/prasad22/healthcare-dataset</w:t>
       </w:r>
     </w:p>
     <w:sectPr>
@@ -3242,7 +4379,7 @@
       <w:rFonts w:asciiTheme="majorHAnsi" w:eastAsiaTheme="majorEastAsia" w:hAnsiTheme="majorHAnsi" w:cstheme="majorBidi"/>
       <w:b/>
       <w:bCs/>
-      <w:color w:val="4F81BD" w:themeColor="accent1"/>
+      <w:color w:val="000000"/>
     </w:rPr>
   </w:style>
   <w:style w:type="paragraph" w:styleId="Heading4">
@@ -3525,7 +4662,7 @@
     </w:pPr>
     <w:rPr>
       <w:rFonts w:asciiTheme="majorHAnsi" w:eastAsiaTheme="majorEastAsia" w:hAnsiTheme="majorHAnsi" w:cstheme="majorBidi"/>
-      <w:color w:val="17365D" w:themeColor="text2" w:themeShade="BF"/>
+      <w:color w:val="000000"/>
       <w:spacing w:val="5"/>
       <w:kern w:val="28"/>
       <w:sz w:val="52"/>

</xml_diff>

<commit_message>
No imputar facturas negativas: marcarlas en Factura_Negativa y excluirlas de los calculos; actualizar notebooks, informe y documentacion
</commit_message>
<xml_diff>
--- a/Informe_Limpieza_Datos_Salud.docx
+++ b/Informe_Limpieza_Datos_Salud.docx
@@ -777,63 +777,11 @@
           <w14:ligatures w14:val="standardContextual"/>
         </w:rPr>
       </w:pPr>
-      <w:hyperlink w:anchor="_Toc240212896" w:history="1">
-        <w:r>
-          <w:rPr>
-            <w:rStyle w:val="Hyperlink"/>
-            <w:noProof/>
-          </w:rPr>
-          <w:t>Corrección aplicada</w:t>
-        </w:r>
-        <w:r>
-          <w:rPr>
-            <w:noProof/>
-            <w:webHidden/>
-          </w:rPr>
-          <w:tab/>
-        </w:r>
-        <w:r>
-          <w:rPr>
-            <w:noProof/>
-            <w:webHidden/>
-          </w:rPr>
-          <w:fldChar w:fldCharType="begin"/>
-        </w:r>
-        <w:r>
-          <w:rPr>
-            <w:noProof/>
-            <w:webHidden/>
-          </w:rPr>
-          <w:instrText xml:space="preserve"> PAGEREF _Toc240212896 \h </w:instrText>
-        </w:r>
-        <w:r>
-          <w:rPr>
-            <w:noProof/>
-            <w:webHidden/>
-          </w:rPr>
-        </w:r>
-        <w:r>
-          <w:rPr>
-            <w:noProof/>
-            <w:webHidden/>
-          </w:rPr>
-          <w:fldChar w:fldCharType="separate"/>
-        </w:r>
-        <w:r>
-          <w:rPr>
-            <w:noProof/>
-            <w:webHidden/>
-          </w:rPr>
-          <w:t>5</w:t>
-        </w:r>
-        <w:r>
-          <w:rPr>
-            <w:noProof/>
-            <w:webHidden/>
-          </w:rPr>
-          <w:fldChar w:fldCharType="end"/>
-        </w:r>
-      </w:hyperlink>
+      <w:r>
+        <w:t>Manejo aplicado: marcado y exclusión</w:t>
+        <w:tab/>
+        <w:t>5</w:t>
+      </w:r>
     </w:p>
     <w:p>
       <w:pPr>
@@ -2208,35 +2156,31 @@
         <w:rPr>
           <w:lang w:val="es-CO"/>
         </w:rPr>
-        <w:t xml:space="preserve">El problema más importante del </w:t>
+        <w:t>El problema más importante del dataset son las facturas con Billing Amount negativo: son 108 en el archivo crudo y quedan 106 después de quitar los duplicados. Una factura de hospital no puede ser negativa, así que el dato está roto de la misma forma que un faltante, aunque no sea un NaN. Para decidir el manejo se aplicó el mismo criterio con el que se clasifican los nulos en MCAR, MAR o MNAR: primero se revisó si la presencia del error depende de alguna otra variable.</w:t>
       </w:r>
       <w:proofErr w:type="spellStart"/>
       <w:r>
         <w:rPr>
           <w:lang w:val="es-CO"/>
         </w:rPr>
-        <w:t>dataset</w:t>
       </w:r>
       <w:proofErr w:type="spellEnd"/>
       <w:r>
         <w:rPr>
           <w:lang w:val="es-CO"/>
         </w:rPr>
-        <w:t xml:space="preserve"> son las facturas con Billing </w:t>
       </w:r>
       <w:proofErr w:type="spellStart"/>
       <w:r>
         <w:rPr>
           <w:lang w:val="es-CO"/>
         </w:rPr>
-        <w:t>Amount</w:t>
       </w:r>
       <w:proofErr w:type="spellEnd"/>
       <w:r>
         <w:rPr>
           <w:lang w:val="es-CO"/>
         </w:rPr>
-        <w:t xml:space="preserve"> negativo: son 106 después de quitar los duplicados (eran 108 en el archivo crudo). Una factura de hospital no puede ser negativa, así que el dato está roto de la misma forma que un faltante, aunque no sea un NaN. Para decidir cómo corregirlas se aplicó el mismo criterio con el que se clasifican los nulos en MCAR, MAR o MNAR: primero se revisó si la presencia del error depende de alguna otra variable.</w:t>
       </w:r>
     </w:p>
     <w:p>
@@ -2393,7 +2337,7 @@
               <w:spacing w:line="240" w:lineRule="auto"/>
             </w:pPr>
             <w:r>
-              <w:t>35,2 %</w:t>
+              <w:t>35,8 %</w:t>
             </w:r>
           </w:p>
         </w:tc>
@@ -2434,7 +2378,7 @@
               <w:spacing w:line="240" w:lineRule="auto"/>
             </w:pPr>
             <w:r>
-              <w:t>34,3 %</w:t>
+              <w:t>34,0 %</w:t>
             </w:r>
           </w:p>
         </w:tc>
@@ -2475,7 +2419,7 @@
               <w:spacing w:line="240" w:lineRule="auto"/>
             </w:pPr>
             <w:r>
-              <w:t>30,6 %</w:t>
+              <w:t>30,2 %</w:t>
             </w:r>
           </w:p>
         </w:tc>
@@ -2520,7 +2464,7 @@
         <w:rPr>
           <w:lang w:val="es-CO"/>
         </w:rPr>
-        <w:t>Corrección aplicada</w:t>
+        <w:t>Manejo aplicado: marcado y exclusión</w:t>
       </w:r>
       <w:bookmarkEnd w:id="7"/>
     </w:p>
@@ -2535,7 +2479,7 @@
         <w:rPr>
           <w:lang w:val="es-CO"/>
         </w:rPr>
-        <w:t>Como el problema es un error al azar (MCAR), lo más seguro era corregir las facturas negativas con la mediana de los valores válidos (25.593,87) en vez de eliminar los registros, porque el resto de la información de la fila sigue siendo útil. Usar cero para reemplazar tampoco era una buena opción, porque distorsiona el promedio real de facturación.</w:t>
+        <w:t>Por tratarse de dinero, no se puede inventar ni reemplazar el monto: imputar un valor (mediana, media o cero) fabricaría un dato que la empresa nunca registró y podría generar pérdidas significativas, porque no hay forma de confirmar cuál era el valor correcto. La decisión fue marcar esas 106 facturas en una columna aparte (Factura_Negativa = True) y excluirlas de todos los cálculos y estadísticas (describe, mediana, IQR), conservando intacto el monto original. Así la información queda disponible para auditoría, pero no contamina el análisis posterior.</w:t>
       </w:r>
     </w:p>
     <w:p>
@@ -2575,7 +2519,7 @@
         <w:rPr>
           <w:lang w:val="es-CO"/>
         </w:rPr>
-        <w:t>Después de corregir la facturación se revisaron las columnas numéricas con la regla de Tukey, que usa los cuartiles y el rango intercuartílico con un factor de 1.5.</w:t>
+        <w:t>Después de marcar la facturación se revisaron las columnas numéricas con la regla de Tukey, que usa los cuartiles y el rango intercuartílico con un factor de 1.5. Las facturas negativas marcadas se excluyen de este cálculo porque su valor no es una medición válida de facturación.</w:t>
       </w:r>
     </w:p>
     <w:p>
@@ -2839,7 +2783,7 @@
               <w:spacing w:line="240" w:lineRule="auto"/>
             </w:pPr>
             <w:r>
-              <w:t>13.326,0</w:t>
+              <w:t>13.299,8</w:t>
             </w:r>
           </w:p>
         </w:tc>
@@ -2852,7 +2796,7 @@
               <w:spacing w:line="240" w:lineRule="auto"/>
             </w:pPr>
             <w:r>
-              <w:t>37.819,9</w:t>
+              <w:t>37.847,1</w:t>
             </w:r>
           </w:p>
         </w:tc>
@@ -2865,7 +2809,7 @@
               <w:spacing w:line="240" w:lineRule="auto"/>
             </w:pPr>
             <w:r>
-              <w:t>24.493,9</w:t>
+              <w:t>24.547,3</w:t>
             </w:r>
           </w:p>
         </w:tc>
@@ -2878,7 +2822,7 @@
               <w:spacing w:line="240" w:lineRule="auto"/>
             </w:pPr>
             <w:r>
-              <w:t>-23.414,8</w:t>
+              <w:t>-23.521,2</w:t>
             </w:r>
           </w:p>
         </w:tc>
@@ -2891,7 +2835,7 @@
               <w:spacing w:line="240" w:lineRule="auto"/>
             </w:pPr>
             <w:r>
-              <w:t>74.560,6</w:t>
+              <w:t>74.668,0</w:t>
             </w:r>
           </w:p>
         </w:tc>
@@ -2908,35 +2852,31 @@
         <w:rPr>
           <w:lang w:val="es-CO"/>
         </w:rPr>
-        <w:t xml:space="preserve">En las dos columnas no hubo ningún valor fuera de los límites, así que no fue necesario recortar nada. Un resultado interesante: el límite inferior de Billing </w:t>
+        <w:t>En las dos columnas no hubo ningún valor fuera de los límites, así que no fue necesario recortar nada. Un detalle importante: la regla IQR no sirve para detectar las facturas negativas, porque estas no son valores extremos de la distribución sino errores de negocio; por eso se tratan aparte, con su marca y su exclusión de los cálculos.</w:t>
       </w:r>
       <w:proofErr w:type="spellStart"/>
       <w:r>
         <w:rPr>
           <w:lang w:val="es-CO"/>
         </w:rPr>
-        <w:t>Amount</w:t>
       </w:r>
       <w:proofErr w:type="spellEnd"/>
       <w:r>
         <w:rPr>
           <w:lang w:val="es-CO"/>
         </w:rPr>
-        <w:t xml:space="preserve"> es -23.414,8, bastante por debajo del mínimo negativo real (-2.008,49). Eso quiere decir que la regla estadística jamás iba a detectar las facturas negativas como </w:t>
       </w:r>
       <w:proofErr w:type="spellStart"/>
       <w:r>
         <w:rPr>
           <w:lang w:val="es-CO"/>
         </w:rPr>
-        <w:t>outliers</w:t>
       </w:r>
       <w:proofErr w:type="spellEnd"/>
       <w:r>
         <w:rPr>
           <w:lang w:val="es-CO"/>
         </w:rPr>
-        <w:t>, porque para la distribución del dato no son valores extremos; solo una regla de negocio como que una factura no puede ser negativa las puede atrapar. Por eso ese problema se trató aparte y no se dejó en manos del IQR.</w:t>
       </w:r>
     </w:p>
     <w:p>
@@ -3039,24 +2979,16 @@
         <w:pStyle w:val="ListBullet"/>
       </w:pPr>
       <w:r>
-        <w:t xml:space="preserve">No </w:t>
+        <w:t>Todas las facturas negativas quedan marcadas en Factura_Negativa y excluidas de los cálculos.</w:t>
       </w:r>
       <w:proofErr w:type="spellStart"/>
-      <w:r>
-        <w:t>quedan</w:t>
-      </w:r>
+      <w:r/>
       <w:proofErr w:type="spellEnd"/>
-      <w:r>
-        <w:t xml:space="preserve"> facturas </w:t>
-      </w:r>
+      <w:r/>
       <w:proofErr w:type="spellStart"/>
-      <w:r>
-        <w:t>negativas</w:t>
-      </w:r>
+      <w:r/>
       <w:proofErr w:type="spellEnd"/>
-      <w:r>
-        <w:t>.</w:t>
-      </w:r>
+      <w:r/>
     </w:p>
     <w:p>
       <w:pPr>
@@ -3083,21 +3015,19 @@
         <w:rPr>
           <w:lang w:val="es-CO"/>
         </w:rPr>
-        <w:t xml:space="preserve">Las cuatro condiciones se cumplieron, así que se exportó el archivo healthcare_dataset_limpio.csv. Si alguna hubiera fallado, no se habría generado el archivo para no dejar salir un </w:t>
+        <w:t>Las condiciones se cumplieron, así que se exportó el archivo healthcare_dataset_limpio.csv. Si alguna hubiera fallado, no se habría generado el archivo para no dejar salir un dataset a medio procesar.</w:t>
       </w:r>
       <w:proofErr w:type="spellStart"/>
       <w:r>
         <w:rPr>
           <w:lang w:val="es-CO"/>
         </w:rPr>
-        <w:t>dataset</w:t>
       </w:r>
       <w:proofErr w:type="spellEnd"/>
       <w:r>
         <w:rPr>
           <w:lang w:val="es-CO"/>
         </w:rPr>
-        <w:t xml:space="preserve"> a medio corregir.</w:t>
       </w:r>
     </w:p>
     <w:p>
@@ -3417,7 +3347,7 @@
               <w:spacing w:line="240" w:lineRule="auto"/>
             </w:pPr>
             <w:r>
-              <w:t>0</w:t>
+              <w:t>106 marcadas</w:t>
             </w:r>
           </w:p>
         </w:tc>
@@ -3550,7 +3480,7 @@
         <w:rPr>
           <w:lang w:val="es-CO"/>
         </w:rPr>
-        <w:t>Un detalle sobre las facturas negativas: al quitar los duplicados quedaron 106 por corregir y no 108, porque dos de las negativas estaban entre las filas repetidas. Eso muestra otro motivo por el que el orden del proceso importa.</w:t>
+        <w:t>Un detalle sobre las facturas negativas: en el crudo son 108 y al quitar los duplicados quedan 106 por marcar, porque dos de las negativas estaban entre las filas repetidas. Con este manejo no se imputa dinero: el monto original se conserva y solo se marca.</w:t>
       </w:r>
     </w:p>
     <w:p>
@@ -3581,35 +3511,31 @@
         <w:rPr>
           <w:lang w:val="es-CO"/>
         </w:rPr>
-        <w:t xml:space="preserve">La limpieza dejó el </w:t>
+        <w:t>La limpieza dejó el dataset en 54.966 filas, sin duplicados y sin nulos. La primera conclusión es que un dataset con cero nulos puede seguir estando sucio: la calidad no se mide solo contando NaN. La segunda es que en datos sensibles como la facturación no se inventan valores: las facturas negativas se marcaron y se excluyeron de los cálculos porque imputar dinero fabricaría información que la empresa nunca registró.</w:t>
       </w:r>
       <w:proofErr w:type="spellStart"/>
       <w:r>
         <w:rPr>
           <w:lang w:val="es-CO"/>
         </w:rPr>
-        <w:t>dataset</w:t>
       </w:r>
       <w:proofErr w:type="spellEnd"/>
       <w:r>
         <w:rPr>
           <w:lang w:val="es-CO"/>
         </w:rPr>
-        <w:t xml:space="preserve"> en 54.966 filas, sin duplicados, sin nulos y sin facturas negativas. La primera conclusión es que un </w:t>
       </w:r>
       <w:proofErr w:type="spellStart"/>
       <w:r>
         <w:rPr>
           <w:lang w:val="es-CO"/>
         </w:rPr>
-        <w:t>dataset</w:t>
       </w:r>
       <w:proofErr w:type="spellEnd"/>
       <w:r>
         <w:rPr>
           <w:lang w:val="es-CO"/>
         </w:rPr>
-        <w:t xml:space="preserve"> con cero nulos puede seguir estando sucio: la calidad no se mide solo contando NaN. La segunda es que el mismo marco que se usa para clasificar los nulos (MCAR, MAR y MNAR) sirve para decidir qué hacer con valores presentes pero imposibles, como la facturación negativa: primero se revisa si el error depende de algo y luego se elige el método.</w:t>
       </w:r>
     </w:p>
     <w:p>
@@ -3623,7 +3549,7 @@
         <w:rPr>
           <w:lang w:val="es-CO"/>
         </w:rPr>
-        <w:t>La tercera es que la estadística por sí sola no basta; el IQR no detectó las facturas negativas porque no son extremos para la distribución, y por eso hacen falta las reglas de negocio. Al final, cada corrección quedó registrada en la salida del script, indicando la columna, el método usado y la cantidad de valores afectados, para poder explicar por qué se hizo.</w:t>
+        <w:t>La tercera es que la estadística por sí sola no basta; el IQR no detectó las facturas negativas porque no son extremos para la distribución, y por eso hacen falta las reglas de negocio. Cada decisión quedó registrada en la salida del script indicando la columna, el método usado y la cantidad de valores afectados, para poder explicar por qué se hizo.</w:t>
       </w:r>
     </w:p>
     <w:sectPr>

</xml_diff>